<commit_message>
docs(pa2): add Non-Functional Requirements section 5.2 and add NFR to section 6
</commit_message>
<xml_diff>
--- a/pa/PA2/T011_PA2.docx
+++ b/pa/PA2/T011_PA2.docx
@@ -567,7 +567,7 @@
     </w:p>
     <w:sdt>
       <w:sdtPr>
-        <w:id w:val="-517035584"/>
+        <w:id w:val="-1250979322"/>
         <w:docPartObj>
           <w:docPartGallery w:val="Table of Contents"/>
           <w:docPartUnique w:val="1"/>
@@ -7103,22 +7103,6 @@
         </w:rPr>
         <w:t xml:space="preserve">Non-Functional Requirements</w:t>
       </w:r>
-    </w:p>
-    <w:p>
-      <w:pPr>
-        <w:ind w:firstLine="576"/>
-        <w:rPr/>
-      </w:pPr>
-      <w:r>
-        <w:rPr>
-          <w:rFonts w:ascii="Arial Unicode MS" w:cs="Arial Unicode MS" w:eastAsia="Arial Unicode MS" w:hAnsi="Arial Unicode MS"/>
-          <w:i w:val="1"/>
-          <w:iCs w:val="1"/>
-          <w:color w:val="0070c0"/>
-          <w:rtl w:val="0"/>
-        </w:rPr>
-        <w:t xml:space="preserve">[Every non-functional requirement must be verifiable: state a metric and the conditions. Example: “Under 200 concurrent users, the search page shall return results in ≤ 1 s at P95.”]</w:t>
-      </w:r>
       <w:r>
         <w:rPr>
           <w:rtl w:val="0"/>
@@ -7166,7 +7150,7 @@
             <w:tcBorders>
               <w:top w:color="000000" w:space="0" w:sz="4" w:val="single"/>
               <w:left w:color="000000" w:space="0" w:sz="4" w:val="single"/>
-              <w:bottom w:color="000000" w:space="0" w:sz="4" w:val="single"/>
+              <w:bottom w:color="000000" w:space="0" w:sz="8" w:val="single"/>
               <w:right w:color="000000" w:space="0" w:sz="4" w:val="single"/>
             </w:tcBorders>
             <w:shd w:fill="548dd4" w:val="clear"/>
@@ -7208,7 +7192,7 @@
             <w:tcBorders>
               <w:top w:color="000000" w:space="0" w:sz="4" w:val="single"/>
               <w:left w:color="000000" w:space="0" w:sz="4" w:val="single"/>
-              <w:bottom w:color="000000" w:space="0" w:sz="4" w:val="single"/>
+              <w:bottom w:color="000000" w:space="0" w:sz="8" w:val="single"/>
               <w:right w:color="000000" w:space="0" w:sz="4" w:val="single"/>
             </w:tcBorders>
             <w:shd w:fill="548dd4" w:val="clear"/>
@@ -7250,7 +7234,7 @@
             <w:tcBorders>
               <w:top w:color="000000" w:space="0" w:sz="4" w:val="single"/>
               <w:left w:color="000000" w:space="0" w:sz="4" w:val="single"/>
-              <w:bottom w:color="000000" w:space="0" w:sz="4" w:val="single"/>
+              <w:bottom w:color="000000" w:space="0" w:sz="8" w:val="single"/>
               <w:right w:color="000000" w:space="0" w:sz="4" w:val="single"/>
             </w:tcBorders>
             <w:shd w:fill="548dd4" w:val="clear"/>
@@ -7292,7 +7276,7 @@
             <w:tcBorders>
               <w:top w:color="000000" w:space="0" w:sz="4" w:val="single"/>
               <w:left w:color="000000" w:space="0" w:sz="4" w:val="single"/>
-              <w:bottom w:color="000000" w:space="0" w:sz="4" w:val="single"/>
+              <w:bottom w:color="000000" w:space="0" w:sz="8" w:val="single"/>
               <w:right w:color="000000" w:space="0" w:sz="4" w:val="single"/>
             </w:tcBorders>
             <w:shd w:fill="548dd4" w:val="clear"/>
@@ -7338,136 +7322,112 @@
         <w:tc>
           <w:tcPr>
             <w:tcBorders>
-              <w:top w:color="000000" w:space="0" w:sz="4" w:val="single"/>
-              <w:left w:color="000000" w:space="0" w:sz="4" w:val="single"/>
-              <w:bottom w:color="000000" w:space="0" w:sz="4" w:val="single"/>
-              <w:right w:color="000000" w:space="0" w:sz="4" w:val="single"/>
-            </w:tcBorders>
-            <w:tcMar>
-              <w:top w:w="0.0" w:type="dxa"/>
-              <w:left w:w="108.0" w:type="dxa"/>
-              <w:bottom w:w="0.0" w:type="dxa"/>
-              <w:right w:w="108.0" w:type="dxa"/>
-            </w:tcMar>
-          </w:tcPr>
-          <w:p>
-            <w:pPr>
-              <w:spacing w:after="40" w:lineRule="auto"/>
-              <w:jc w:val="left"/>
-              <w:rPr/>
-            </w:pPr>
-            <w:r>
-              <w:rPr>
-                <w:b w:val="0"/>
-                <w:bCs w:val="0"/>
-                <w:i w:val="0"/>
-                <w:iCs w:val="0"/>
-                <w:sz w:val="20"/>
-                <w:szCs w:val="20"/>
+              <w:top w:color="000000" w:space="0" w:sz="8" w:val="single"/>
+              <w:left w:color="000000" w:space="0" w:sz="8" w:val="single"/>
+              <w:bottom w:color="000000" w:space="0" w:sz="8" w:val="single"/>
+              <w:right w:color="000000" w:space="0" w:sz="8" w:val="single"/>
+            </w:tcBorders>
+            <w:tcMar>
+              <w:top w:w="100.0" w:type="dxa"/>
+              <w:left w:w="100.0" w:type="dxa"/>
+              <w:bottom w:w="100.0" w:type="dxa"/>
+              <w:right w:w="100.0" w:type="dxa"/>
+            </w:tcMar>
+            <w:vAlign w:val="top"/>
+          </w:tcPr>
+          <w:p>
+            <w:pPr>
+              <w:rPr/>
+            </w:pPr>
+            <w:r>
+              <w:rPr>
                 <w:rtl w:val="0"/>
               </w:rPr>
               <w:t xml:space="preserve">NFR-01</w:t>
             </w:r>
-            <w:r>
-              <w:rPr>
-                <w:rtl w:val="0"/>
-              </w:rPr>
-            </w:r>
-          </w:p>
-        </w:tc>
-        <w:tc>
-          <w:tcPr>
-            <w:tcBorders>
-              <w:top w:color="000000" w:space="0" w:sz="4" w:val="single"/>
-              <w:left w:color="000000" w:space="0" w:sz="4" w:val="single"/>
-              <w:bottom w:color="000000" w:space="0" w:sz="4" w:val="single"/>
-              <w:right w:color="000000" w:space="0" w:sz="4" w:val="single"/>
-            </w:tcBorders>
-            <w:tcMar>
-              <w:top w:w="0.0" w:type="dxa"/>
-              <w:left w:w="108.0" w:type="dxa"/>
-              <w:bottom w:w="0.0" w:type="dxa"/>
-              <w:right w:w="108.0" w:type="dxa"/>
-            </w:tcMar>
-          </w:tcPr>
-          <w:p>
-            <w:pPr>
-              <w:spacing w:after="40" w:lineRule="auto"/>
-              <w:jc w:val="left"/>
-              <w:rPr/>
-            </w:pPr>
-            <w:r>
-              <w:rPr>
-                <w:b w:val="0"/>
-                <w:bCs w:val="0"/>
-                <w:i w:val="0"/>
-                <w:iCs w:val="0"/>
-                <w:sz w:val="20"/>
-                <w:szCs w:val="20"/>
+          </w:p>
+        </w:tc>
+        <w:tc>
+          <w:tcPr>
+            <w:tcBorders>
+              <w:top w:color="000000" w:space="0" w:sz="8" w:val="single"/>
+              <w:left w:color="000000" w:space="0" w:sz="8" w:val="single"/>
+              <w:bottom w:color="000000" w:space="0" w:sz="8" w:val="single"/>
+              <w:right w:color="000000" w:space="0" w:sz="8" w:val="single"/>
+            </w:tcBorders>
+            <w:tcMar>
+              <w:top w:w="100.0" w:type="dxa"/>
+              <w:left w:w="100.0" w:type="dxa"/>
+              <w:bottom w:w="100.0" w:type="dxa"/>
+              <w:right w:w="100.0" w:type="dxa"/>
+            </w:tcMar>
+            <w:vAlign w:val="top"/>
+          </w:tcPr>
+          <w:p>
+            <w:pPr>
+              <w:rPr/>
+            </w:pPr>
+            <w:r>
+              <w:rPr>
                 <w:rtl w:val="0"/>
               </w:rPr>
               <w:t xml:space="preserve">Performance</w:t>
             </w:r>
-            <w:r>
-              <w:rPr>
-                <w:rtl w:val="0"/>
-              </w:rPr>
-            </w:r>
-          </w:p>
-        </w:tc>
-        <w:tc>
-          <w:tcPr>
-            <w:tcBorders>
-              <w:top w:color="000000" w:space="0" w:sz="4" w:val="single"/>
-              <w:left w:color="000000" w:space="0" w:sz="4" w:val="single"/>
-              <w:bottom w:color="000000" w:space="0" w:sz="4" w:val="single"/>
-              <w:right w:color="000000" w:space="0" w:sz="4" w:val="single"/>
-            </w:tcBorders>
-            <w:tcMar>
-              <w:top w:w="0.0" w:type="dxa"/>
-              <w:left w:w="108.0" w:type="dxa"/>
-              <w:bottom w:w="0.0" w:type="dxa"/>
-              <w:right w:w="108.0" w:type="dxa"/>
-            </w:tcMar>
-          </w:tcPr>
-          <w:p>
-            <w:pPr>
-              <w:spacing w:after="40" w:lineRule="auto"/>
-              <w:jc w:val="left"/>
-              <w:rPr/>
-            </w:pPr>
-            <w:r>
-              <w:rPr>
-                <w:rtl w:val="0"/>
-              </w:rPr>
-            </w:r>
-          </w:p>
-        </w:tc>
-        <w:tc>
-          <w:tcPr>
-            <w:tcBorders>
-              <w:top w:color="000000" w:space="0" w:sz="4" w:val="single"/>
-              <w:left w:color="000000" w:space="0" w:sz="4" w:val="single"/>
-              <w:bottom w:color="000000" w:space="0" w:sz="4" w:val="single"/>
-              <w:right w:color="000000" w:space="0" w:sz="4" w:val="single"/>
-            </w:tcBorders>
-            <w:tcMar>
-              <w:top w:w="0.0" w:type="dxa"/>
-              <w:left w:w="108.0" w:type="dxa"/>
-              <w:bottom w:w="0.0" w:type="dxa"/>
-              <w:right w:w="108.0" w:type="dxa"/>
-            </w:tcMar>
-          </w:tcPr>
-          <w:p>
-            <w:pPr>
-              <w:spacing w:after="40" w:lineRule="auto"/>
-              <w:jc w:val="left"/>
-              <w:rPr/>
-            </w:pPr>
-            <w:r>
-              <w:rPr>
-                <w:rtl w:val="0"/>
-              </w:rPr>
+          </w:p>
+        </w:tc>
+        <w:tc>
+          <w:tcPr>
+            <w:tcBorders>
+              <w:top w:color="000000" w:space="0" w:sz="8" w:val="single"/>
+              <w:left w:color="000000" w:space="0" w:sz="8" w:val="single"/>
+              <w:bottom w:color="000000" w:space="0" w:sz="8" w:val="single"/>
+              <w:right w:color="000000" w:space="0" w:sz="8" w:val="single"/>
+            </w:tcBorders>
+            <w:tcMar>
+              <w:top w:w="100.0" w:type="dxa"/>
+              <w:left w:w="100.0" w:type="dxa"/>
+              <w:bottom w:w="100.0" w:type="dxa"/>
+              <w:right w:w="100.0" w:type="dxa"/>
+            </w:tcMar>
+            <w:vAlign w:val="top"/>
+          </w:tcPr>
+          <w:p>
+            <w:pPr>
+              <w:rPr/>
+            </w:pPr>
+            <w:r>
+              <w:rPr>
+                <w:rtl w:val="0"/>
+              </w:rPr>
+              <w:t xml:space="preserve">Với 100 người dùng truy cập đồng thời, chức năng tìm kiếm và lọc bài đăng phải trả kết quả trong ≤ 2 giây ở P95 (95% số yêu cầu).</w:t>
+            </w:r>
+          </w:p>
+        </w:tc>
+        <w:tc>
+          <w:tcPr>
+            <w:tcBorders>
+              <w:top w:color="000000" w:space="0" w:sz="8" w:val="single"/>
+              <w:left w:color="000000" w:space="0" w:sz="8" w:val="single"/>
+              <w:bottom w:color="000000" w:space="0" w:sz="8" w:val="single"/>
+              <w:right w:color="000000" w:space="0" w:sz="8" w:val="single"/>
+            </w:tcBorders>
+            <w:tcMar>
+              <w:top w:w="100.0" w:type="dxa"/>
+              <w:left w:w="100.0" w:type="dxa"/>
+              <w:bottom w:w="100.0" w:type="dxa"/>
+              <w:right w:w="100.0" w:type="dxa"/>
+            </w:tcMar>
+            <w:vAlign w:val="top"/>
+          </w:tcPr>
+          <w:p>
+            <w:pPr>
+              <w:rPr/>
+            </w:pPr>
+            <w:r>
+              <w:rPr>
+                <w:rtl w:val="0"/>
+              </w:rPr>
+              <w:t xml:space="preserve">Chạy load test bằng k6 trong 5 phút với 100 người dùng ảo trên môi trường staging; đọc chỉ số thời gian phản hồi P95 trong báo cáo k6.</w:t>
             </w:r>
           </w:p>
         </w:tc>
@@ -7480,136 +7440,112 @@
         <w:tc>
           <w:tcPr>
             <w:tcBorders>
-              <w:top w:color="000000" w:space="0" w:sz="4" w:val="single"/>
-              <w:left w:color="000000" w:space="0" w:sz="4" w:val="single"/>
-              <w:bottom w:color="000000" w:space="0" w:sz="4" w:val="single"/>
-              <w:right w:color="000000" w:space="0" w:sz="4" w:val="single"/>
-            </w:tcBorders>
-            <w:tcMar>
-              <w:top w:w="0.0" w:type="dxa"/>
-              <w:left w:w="108.0" w:type="dxa"/>
-              <w:bottom w:w="0.0" w:type="dxa"/>
-              <w:right w:w="108.0" w:type="dxa"/>
-            </w:tcMar>
-          </w:tcPr>
-          <w:p>
-            <w:pPr>
-              <w:spacing w:after="40" w:lineRule="auto"/>
-              <w:jc w:val="left"/>
-              <w:rPr/>
-            </w:pPr>
-            <w:r>
-              <w:rPr>
-                <w:b w:val="0"/>
-                <w:bCs w:val="0"/>
-                <w:i w:val="0"/>
-                <w:iCs w:val="0"/>
-                <w:sz w:val="20"/>
-                <w:szCs w:val="20"/>
+              <w:top w:color="000000" w:space="0" w:sz="8" w:val="single"/>
+              <w:left w:color="000000" w:space="0" w:sz="8" w:val="single"/>
+              <w:bottom w:color="000000" w:space="0" w:sz="8" w:val="single"/>
+              <w:right w:color="000000" w:space="0" w:sz="8" w:val="single"/>
+            </w:tcBorders>
+            <w:tcMar>
+              <w:top w:w="100.0" w:type="dxa"/>
+              <w:left w:w="100.0" w:type="dxa"/>
+              <w:bottom w:w="100.0" w:type="dxa"/>
+              <w:right w:w="100.0" w:type="dxa"/>
+            </w:tcMar>
+            <w:vAlign w:val="top"/>
+          </w:tcPr>
+          <w:p>
+            <w:pPr>
+              <w:rPr/>
+            </w:pPr>
+            <w:r>
+              <w:rPr>
                 <w:rtl w:val="0"/>
               </w:rPr>
               <w:t xml:space="preserve">NFR-02</w:t>
             </w:r>
-            <w:r>
-              <w:rPr>
-                <w:rtl w:val="0"/>
-              </w:rPr>
-            </w:r>
-          </w:p>
-        </w:tc>
-        <w:tc>
-          <w:tcPr>
-            <w:tcBorders>
-              <w:top w:color="000000" w:space="0" w:sz="4" w:val="single"/>
-              <w:left w:color="000000" w:space="0" w:sz="4" w:val="single"/>
-              <w:bottom w:color="000000" w:space="0" w:sz="4" w:val="single"/>
-              <w:right w:color="000000" w:space="0" w:sz="4" w:val="single"/>
-            </w:tcBorders>
-            <w:tcMar>
-              <w:top w:w="0.0" w:type="dxa"/>
-              <w:left w:w="108.0" w:type="dxa"/>
-              <w:bottom w:w="0.0" w:type="dxa"/>
-              <w:right w:w="108.0" w:type="dxa"/>
-            </w:tcMar>
-          </w:tcPr>
-          <w:p>
-            <w:pPr>
-              <w:spacing w:after="40" w:lineRule="auto"/>
-              <w:jc w:val="left"/>
-              <w:rPr/>
-            </w:pPr>
-            <w:r>
-              <w:rPr>
-                <w:b w:val="0"/>
-                <w:bCs w:val="0"/>
-                <w:i w:val="0"/>
-                <w:iCs w:val="0"/>
-                <w:sz w:val="20"/>
-                <w:szCs w:val="20"/>
+          </w:p>
+        </w:tc>
+        <w:tc>
+          <w:tcPr>
+            <w:tcBorders>
+              <w:top w:color="000000" w:space="0" w:sz="8" w:val="single"/>
+              <w:left w:color="000000" w:space="0" w:sz="8" w:val="single"/>
+              <w:bottom w:color="000000" w:space="0" w:sz="8" w:val="single"/>
+              <w:right w:color="000000" w:space="0" w:sz="8" w:val="single"/>
+            </w:tcBorders>
+            <w:tcMar>
+              <w:top w:w="100.0" w:type="dxa"/>
+              <w:left w:w="100.0" w:type="dxa"/>
+              <w:bottom w:w="100.0" w:type="dxa"/>
+              <w:right w:w="100.0" w:type="dxa"/>
+            </w:tcMar>
+            <w:vAlign w:val="top"/>
+          </w:tcPr>
+          <w:p>
+            <w:pPr>
+              <w:rPr/>
+            </w:pPr>
+            <w:r>
+              <w:rPr>
                 <w:rtl w:val="0"/>
               </w:rPr>
               <w:t xml:space="preserve">Security</w:t>
             </w:r>
-            <w:r>
-              <w:rPr>
-                <w:rtl w:val="0"/>
-              </w:rPr>
-            </w:r>
-          </w:p>
-        </w:tc>
-        <w:tc>
-          <w:tcPr>
-            <w:tcBorders>
-              <w:top w:color="000000" w:space="0" w:sz="4" w:val="single"/>
-              <w:left w:color="000000" w:space="0" w:sz="4" w:val="single"/>
-              <w:bottom w:color="000000" w:space="0" w:sz="4" w:val="single"/>
-              <w:right w:color="000000" w:space="0" w:sz="4" w:val="single"/>
-            </w:tcBorders>
-            <w:tcMar>
-              <w:top w:w="0.0" w:type="dxa"/>
-              <w:left w:w="108.0" w:type="dxa"/>
-              <w:bottom w:w="0.0" w:type="dxa"/>
-              <w:right w:w="108.0" w:type="dxa"/>
-            </w:tcMar>
-          </w:tcPr>
-          <w:p>
-            <w:pPr>
-              <w:spacing w:after="40" w:lineRule="auto"/>
-              <w:jc w:val="left"/>
-              <w:rPr/>
-            </w:pPr>
-            <w:r>
-              <w:rPr>
-                <w:rtl w:val="0"/>
-              </w:rPr>
-            </w:r>
-          </w:p>
-        </w:tc>
-        <w:tc>
-          <w:tcPr>
-            <w:tcBorders>
-              <w:top w:color="000000" w:space="0" w:sz="4" w:val="single"/>
-              <w:left w:color="000000" w:space="0" w:sz="4" w:val="single"/>
-              <w:bottom w:color="000000" w:space="0" w:sz="4" w:val="single"/>
-              <w:right w:color="000000" w:space="0" w:sz="4" w:val="single"/>
-            </w:tcBorders>
-            <w:tcMar>
-              <w:top w:w="0.0" w:type="dxa"/>
-              <w:left w:w="108.0" w:type="dxa"/>
-              <w:bottom w:w="0.0" w:type="dxa"/>
-              <w:right w:w="108.0" w:type="dxa"/>
-            </w:tcMar>
-          </w:tcPr>
-          <w:p>
-            <w:pPr>
-              <w:spacing w:after="40" w:lineRule="auto"/>
-              <w:jc w:val="left"/>
-              <w:rPr/>
-            </w:pPr>
-            <w:r>
-              <w:rPr>
-                <w:rtl w:val="0"/>
-              </w:rPr>
+          </w:p>
+        </w:tc>
+        <w:tc>
+          <w:tcPr>
+            <w:tcBorders>
+              <w:top w:color="000000" w:space="0" w:sz="8" w:val="single"/>
+              <w:left w:color="000000" w:space="0" w:sz="8" w:val="single"/>
+              <w:bottom w:color="000000" w:space="0" w:sz="8" w:val="single"/>
+              <w:right w:color="000000" w:space="0" w:sz="8" w:val="single"/>
+            </w:tcBorders>
+            <w:tcMar>
+              <w:top w:w="100.0" w:type="dxa"/>
+              <w:left w:w="100.0" w:type="dxa"/>
+              <w:bottom w:w="100.0" w:type="dxa"/>
+              <w:right w:w="100.0" w:type="dxa"/>
+            </w:tcMar>
+            <w:vAlign w:val="top"/>
+          </w:tcPr>
+          <w:p>
+            <w:pPr>
+              <w:rPr/>
+            </w:pPr>
+            <w:r>
+              <w:rPr>
+                <w:rtl w:val="0"/>
+              </w:rPr>
+              <w:t xml:space="preserve">Thông tin liên hệ (SĐT, email cá nhân) của Post Owner không được xuất hiện trong bất kỳ API response nào gửi cho người dùng khác khi Claim của họ chưa được chấp nhận. 100% kết nối phải dùng HTTPS; truy cập bằng HTTP phải tự chuyển sang HTTPS.</w:t>
+            </w:r>
+          </w:p>
+        </w:tc>
+        <w:tc>
+          <w:tcPr>
+            <w:tcBorders>
+              <w:top w:color="000000" w:space="0" w:sz="8" w:val="single"/>
+              <w:left w:color="000000" w:space="0" w:sz="8" w:val="single"/>
+              <w:bottom w:color="000000" w:space="0" w:sz="8" w:val="single"/>
+              <w:right w:color="000000" w:space="0" w:sz="8" w:val="single"/>
+            </w:tcBorders>
+            <w:tcMar>
+              <w:top w:w="100.0" w:type="dxa"/>
+              <w:left w:w="100.0" w:type="dxa"/>
+              <w:bottom w:w="100.0" w:type="dxa"/>
+              <w:right w:w="100.0" w:type="dxa"/>
+            </w:tcMar>
+            <w:vAlign w:val="top"/>
+          </w:tcPr>
+          <w:p>
+            <w:pPr>
+              <w:rPr/>
+            </w:pPr>
+            <w:r>
+              <w:rPr>
+                <w:rtl w:val="0"/>
+              </w:rPr>
+              <w:t xml:space="preserve">Dùng Postman gọi API chi tiết bài đăng bằng 3 loại tài khoản (Khách, Sinh viên khác, Claimant chưa được chấp nhận) và kiểm tra response không chứa trường liên hệ. Truy cập trang bằng địa chỉ http:// để kiểm tra có tự chuyển sang https://.</w:t>
             </w:r>
           </w:p>
         </w:tc>
@@ -7622,136 +7558,112 @@
         <w:tc>
           <w:tcPr>
             <w:tcBorders>
-              <w:top w:color="000000" w:space="0" w:sz="4" w:val="single"/>
-              <w:left w:color="000000" w:space="0" w:sz="4" w:val="single"/>
-              <w:bottom w:color="000000" w:space="0" w:sz="4" w:val="single"/>
-              <w:right w:color="000000" w:space="0" w:sz="4" w:val="single"/>
-            </w:tcBorders>
-            <w:tcMar>
-              <w:top w:w="0.0" w:type="dxa"/>
-              <w:left w:w="108.0" w:type="dxa"/>
-              <w:bottom w:w="0.0" w:type="dxa"/>
-              <w:right w:w="108.0" w:type="dxa"/>
-            </w:tcMar>
-          </w:tcPr>
-          <w:p>
-            <w:pPr>
-              <w:spacing w:after="40" w:lineRule="auto"/>
-              <w:jc w:val="left"/>
-              <w:rPr/>
-            </w:pPr>
-            <w:r>
-              <w:rPr>
-                <w:b w:val="0"/>
-                <w:bCs w:val="0"/>
-                <w:i w:val="0"/>
-                <w:iCs w:val="0"/>
-                <w:sz w:val="20"/>
-                <w:szCs w:val="20"/>
+              <w:top w:color="000000" w:space="0" w:sz="8" w:val="single"/>
+              <w:left w:color="000000" w:space="0" w:sz="8" w:val="single"/>
+              <w:bottom w:color="000000" w:space="0" w:sz="8" w:val="single"/>
+              <w:right w:color="000000" w:space="0" w:sz="8" w:val="single"/>
+            </w:tcBorders>
+            <w:tcMar>
+              <w:top w:w="100.0" w:type="dxa"/>
+              <w:left w:w="100.0" w:type="dxa"/>
+              <w:bottom w:w="100.0" w:type="dxa"/>
+              <w:right w:w="100.0" w:type="dxa"/>
+            </w:tcMar>
+            <w:vAlign w:val="top"/>
+          </w:tcPr>
+          <w:p>
+            <w:pPr>
+              <w:rPr/>
+            </w:pPr>
+            <w:r>
+              <w:rPr>
                 <w:rtl w:val="0"/>
               </w:rPr>
               <w:t xml:space="preserve">NFR-03</w:t>
             </w:r>
-            <w:r>
-              <w:rPr>
-                <w:rtl w:val="0"/>
-              </w:rPr>
-            </w:r>
-          </w:p>
-        </w:tc>
-        <w:tc>
-          <w:tcPr>
-            <w:tcBorders>
-              <w:top w:color="000000" w:space="0" w:sz="4" w:val="single"/>
-              <w:left w:color="000000" w:space="0" w:sz="4" w:val="single"/>
-              <w:bottom w:color="000000" w:space="0" w:sz="4" w:val="single"/>
-              <w:right w:color="000000" w:space="0" w:sz="4" w:val="single"/>
-            </w:tcBorders>
-            <w:tcMar>
-              <w:top w:w="0.0" w:type="dxa"/>
-              <w:left w:w="108.0" w:type="dxa"/>
-              <w:bottom w:w="0.0" w:type="dxa"/>
-              <w:right w:w="108.0" w:type="dxa"/>
-            </w:tcMar>
-          </w:tcPr>
-          <w:p>
-            <w:pPr>
-              <w:spacing w:after="40" w:lineRule="auto"/>
-              <w:jc w:val="left"/>
-              <w:rPr/>
-            </w:pPr>
-            <w:r>
-              <w:rPr>
-                <w:b w:val="0"/>
-                <w:bCs w:val="0"/>
-                <w:i w:val="0"/>
-                <w:iCs w:val="0"/>
-                <w:sz w:val="20"/>
-                <w:szCs w:val="20"/>
+          </w:p>
+        </w:tc>
+        <w:tc>
+          <w:tcPr>
+            <w:tcBorders>
+              <w:top w:color="000000" w:space="0" w:sz="8" w:val="single"/>
+              <w:left w:color="000000" w:space="0" w:sz="8" w:val="single"/>
+              <w:bottom w:color="000000" w:space="0" w:sz="8" w:val="single"/>
+              <w:right w:color="000000" w:space="0" w:sz="8" w:val="single"/>
+            </w:tcBorders>
+            <w:tcMar>
+              <w:top w:w="100.0" w:type="dxa"/>
+              <w:left w:w="100.0" w:type="dxa"/>
+              <w:bottom w:w="100.0" w:type="dxa"/>
+              <w:right w:w="100.0" w:type="dxa"/>
+            </w:tcMar>
+            <w:vAlign w:val="top"/>
+          </w:tcPr>
+          <w:p>
+            <w:pPr>
+              <w:rPr/>
+            </w:pPr>
+            <w:r>
+              <w:rPr>
                 <w:rtl w:val="0"/>
               </w:rPr>
               <w:t xml:space="preserve">Usability</w:t>
             </w:r>
-            <w:r>
-              <w:rPr>
-                <w:rtl w:val="0"/>
-              </w:rPr>
-            </w:r>
-          </w:p>
-        </w:tc>
-        <w:tc>
-          <w:tcPr>
-            <w:tcBorders>
-              <w:top w:color="000000" w:space="0" w:sz="4" w:val="single"/>
-              <w:left w:color="000000" w:space="0" w:sz="4" w:val="single"/>
-              <w:bottom w:color="000000" w:space="0" w:sz="4" w:val="single"/>
-              <w:right w:color="000000" w:space="0" w:sz="4" w:val="single"/>
-            </w:tcBorders>
-            <w:tcMar>
-              <w:top w:w="0.0" w:type="dxa"/>
-              <w:left w:w="108.0" w:type="dxa"/>
-              <w:bottom w:w="0.0" w:type="dxa"/>
-              <w:right w:w="108.0" w:type="dxa"/>
-            </w:tcMar>
-          </w:tcPr>
-          <w:p>
-            <w:pPr>
-              <w:spacing w:after="40" w:lineRule="auto"/>
-              <w:jc w:val="left"/>
-              <w:rPr/>
-            </w:pPr>
-            <w:r>
-              <w:rPr>
-                <w:rtl w:val="0"/>
-              </w:rPr>
-            </w:r>
-          </w:p>
-        </w:tc>
-        <w:tc>
-          <w:tcPr>
-            <w:tcBorders>
-              <w:top w:color="000000" w:space="0" w:sz="4" w:val="single"/>
-              <w:left w:color="000000" w:space="0" w:sz="4" w:val="single"/>
-              <w:bottom w:color="000000" w:space="0" w:sz="4" w:val="single"/>
-              <w:right w:color="000000" w:space="0" w:sz="4" w:val="single"/>
-            </w:tcBorders>
-            <w:tcMar>
-              <w:top w:w="0.0" w:type="dxa"/>
-              <w:left w:w="108.0" w:type="dxa"/>
-              <w:bottom w:w="0.0" w:type="dxa"/>
-              <w:right w:w="108.0" w:type="dxa"/>
-            </w:tcMar>
-          </w:tcPr>
-          <w:p>
-            <w:pPr>
-              <w:spacing w:after="40" w:lineRule="auto"/>
-              <w:jc w:val="left"/>
-              <w:rPr/>
-            </w:pPr>
-            <w:r>
-              <w:rPr>
-                <w:rtl w:val="0"/>
-              </w:rPr>
+          </w:p>
+        </w:tc>
+        <w:tc>
+          <w:tcPr>
+            <w:tcBorders>
+              <w:top w:color="000000" w:space="0" w:sz="8" w:val="single"/>
+              <w:left w:color="000000" w:space="0" w:sz="8" w:val="single"/>
+              <w:bottom w:color="000000" w:space="0" w:sz="8" w:val="single"/>
+              <w:right w:color="000000" w:space="0" w:sz="8" w:val="single"/>
+            </w:tcBorders>
+            <w:tcMar>
+              <w:top w:w="100.0" w:type="dxa"/>
+              <w:left w:w="100.0" w:type="dxa"/>
+              <w:bottom w:w="100.0" w:type="dxa"/>
+              <w:right w:w="100.0" w:type="dxa"/>
+            </w:tcMar>
+            <w:vAlign w:val="top"/>
+          </w:tcPr>
+          <w:p>
+            <w:pPr>
+              <w:rPr/>
+            </w:pPr>
+            <w:r>
+              <w:rPr>
+                <w:rtl w:val="0"/>
+              </w:rPr>
+              <w:t xml:space="preserve">Sinh viên sử dụng hệ thống lần đầu phải tạo được một bài đăng hoàn chỉnh trong ≤ 3 phút mà không cần hướng dẫn.</w:t>
+            </w:r>
+          </w:p>
+        </w:tc>
+        <w:tc>
+          <w:tcPr>
+            <w:tcBorders>
+              <w:top w:color="000000" w:space="0" w:sz="8" w:val="single"/>
+              <w:left w:color="000000" w:space="0" w:sz="8" w:val="single"/>
+              <w:bottom w:color="000000" w:space="0" w:sz="8" w:val="single"/>
+              <w:right w:color="000000" w:space="0" w:sz="8" w:val="single"/>
+            </w:tcBorders>
+            <w:tcMar>
+              <w:top w:w="100.0" w:type="dxa"/>
+              <w:left w:w="100.0" w:type="dxa"/>
+              <w:bottom w:w="100.0" w:type="dxa"/>
+              <w:right w:w="100.0" w:type="dxa"/>
+            </w:tcMar>
+            <w:vAlign w:val="top"/>
+          </w:tcPr>
+          <w:p>
+            <w:pPr>
+              <w:rPr/>
+            </w:pPr>
+            <w:r>
+              <w:rPr>
+                <w:rtl w:val="0"/>
+              </w:rPr>
+              <w:t xml:space="preserve">Usability test với 5 sinh viên chưa từng dùng hệ thống, bấm giờ từng người; đạt khi ít nhất 4/5 người hoàn thành trong ≤ 3 phút.</w:t>
             </w:r>
           </w:p>
         </w:tc>
@@ -7764,112 +7676,112 @@
         <w:tc>
           <w:tcPr>
             <w:tcBorders>
-              <w:top w:color="000000" w:space="0" w:sz="4" w:val="single"/>
-              <w:left w:color="000000" w:space="0" w:sz="4" w:val="single"/>
-              <w:bottom w:color="000000" w:space="0" w:sz="4" w:val="single"/>
-              <w:right w:color="000000" w:space="0" w:sz="4" w:val="single"/>
-            </w:tcBorders>
-            <w:tcMar>
-              <w:top w:w="0.0" w:type="dxa"/>
-              <w:left w:w="108.0" w:type="dxa"/>
-              <w:bottom w:w="0.0" w:type="dxa"/>
-              <w:right w:w="108.0" w:type="dxa"/>
-            </w:tcMar>
-          </w:tcPr>
-          <w:p>
-            <w:pPr>
-              <w:spacing w:after="40" w:lineRule="auto"/>
-              <w:jc w:val="left"/>
-              <w:rPr/>
-            </w:pPr>
-            <w:r>
-              <w:rPr>
-                <w:rtl w:val="0"/>
-              </w:rPr>
-            </w:r>
-          </w:p>
-        </w:tc>
-        <w:tc>
-          <w:tcPr>
-            <w:tcBorders>
-              <w:top w:color="000000" w:space="0" w:sz="4" w:val="single"/>
-              <w:left w:color="000000" w:space="0" w:sz="4" w:val="single"/>
-              <w:bottom w:color="000000" w:space="0" w:sz="4" w:val="single"/>
-              <w:right w:color="000000" w:space="0" w:sz="4" w:val="single"/>
-            </w:tcBorders>
-            <w:tcMar>
-              <w:top w:w="0.0" w:type="dxa"/>
-              <w:left w:w="108.0" w:type="dxa"/>
-              <w:bottom w:w="0.0" w:type="dxa"/>
-              <w:right w:w="108.0" w:type="dxa"/>
-            </w:tcMar>
-          </w:tcPr>
-          <w:p>
-            <w:pPr>
-              <w:spacing w:after="40" w:lineRule="auto"/>
-              <w:jc w:val="left"/>
-              <w:rPr/>
-            </w:pPr>
-            <w:r>
-              <w:rPr>
-                <w:rtl w:val="0"/>
-              </w:rPr>
-            </w:r>
-          </w:p>
-        </w:tc>
-        <w:tc>
-          <w:tcPr>
-            <w:tcBorders>
-              <w:top w:color="000000" w:space="0" w:sz="4" w:val="single"/>
-              <w:left w:color="000000" w:space="0" w:sz="4" w:val="single"/>
-              <w:bottom w:color="000000" w:space="0" w:sz="4" w:val="single"/>
-              <w:right w:color="000000" w:space="0" w:sz="4" w:val="single"/>
-            </w:tcBorders>
-            <w:tcMar>
-              <w:top w:w="0.0" w:type="dxa"/>
-              <w:left w:w="108.0" w:type="dxa"/>
-              <w:bottom w:w="0.0" w:type="dxa"/>
-              <w:right w:w="108.0" w:type="dxa"/>
-            </w:tcMar>
-          </w:tcPr>
-          <w:p>
-            <w:pPr>
-              <w:spacing w:after="40" w:lineRule="auto"/>
-              <w:jc w:val="left"/>
-              <w:rPr/>
-            </w:pPr>
-            <w:r>
-              <w:rPr>
-                <w:rtl w:val="0"/>
-              </w:rPr>
-            </w:r>
-          </w:p>
-        </w:tc>
-        <w:tc>
-          <w:tcPr>
-            <w:tcBorders>
-              <w:top w:color="000000" w:space="0" w:sz="4" w:val="single"/>
-              <w:left w:color="000000" w:space="0" w:sz="4" w:val="single"/>
-              <w:bottom w:color="000000" w:space="0" w:sz="4" w:val="single"/>
-              <w:right w:color="000000" w:space="0" w:sz="4" w:val="single"/>
-            </w:tcBorders>
-            <w:tcMar>
-              <w:top w:w="0.0" w:type="dxa"/>
-              <w:left w:w="108.0" w:type="dxa"/>
-              <w:bottom w:w="0.0" w:type="dxa"/>
-              <w:right w:w="108.0" w:type="dxa"/>
-            </w:tcMar>
-          </w:tcPr>
-          <w:p>
-            <w:pPr>
-              <w:spacing w:after="40" w:lineRule="auto"/>
-              <w:jc w:val="left"/>
-              <w:rPr/>
-            </w:pPr>
-            <w:r>
-              <w:rPr>
-                <w:rtl w:val="0"/>
-              </w:rPr>
+              <w:top w:color="000000" w:space="0" w:sz="8" w:val="single"/>
+              <w:left w:color="000000" w:space="0" w:sz="8" w:val="single"/>
+              <w:bottom w:color="000000" w:space="0" w:sz="8" w:val="single"/>
+              <w:right w:color="000000" w:space="0" w:sz="8" w:val="single"/>
+            </w:tcBorders>
+            <w:tcMar>
+              <w:top w:w="100.0" w:type="dxa"/>
+              <w:left w:w="100.0" w:type="dxa"/>
+              <w:bottom w:w="100.0" w:type="dxa"/>
+              <w:right w:w="100.0" w:type="dxa"/>
+            </w:tcMar>
+            <w:vAlign w:val="top"/>
+          </w:tcPr>
+          <w:p>
+            <w:pPr>
+              <w:rPr/>
+            </w:pPr>
+            <w:r>
+              <w:rPr>
+                <w:rtl w:val="0"/>
+              </w:rPr>
+              <w:t xml:space="preserve">NFR-04</w:t>
+            </w:r>
+          </w:p>
+        </w:tc>
+        <w:tc>
+          <w:tcPr>
+            <w:tcBorders>
+              <w:top w:color="000000" w:space="0" w:sz="8" w:val="single"/>
+              <w:left w:color="000000" w:space="0" w:sz="8" w:val="single"/>
+              <w:bottom w:color="000000" w:space="0" w:sz="8" w:val="single"/>
+              <w:right w:color="000000" w:space="0" w:sz="8" w:val="single"/>
+            </w:tcBorders>
+            <w:tcMar>
+              <w:top w:w="100.0" w:type="dxa"/>
+              <w:left w:w="100.0" w:type="dxa"/>
+              <w:bottom w:w="100.0" w:type="dxa"/>
+              <w:right w:w="100.0" w:type="dxa"/>
+            </w:tcMar>
+            <w:vAlign w:val="top"/>
+          </w:tcPr>
+          <w:p>
+            <w:pPr>
+              <w:rPr/>
+            </w:pPr>
+            <w:r>
+              <w:rPr>
+                <w:rtl w:val="0"/>
+              </w:rPr>
+              <w:t xml:space="preserve">Compatibility</w:t>
+            </w:r>
+          </w:p>
+        </w:tc>
+        <w:tc>
+          <w:tcPr>
+            <w:tcBorders>
+              <w:top w:color="000000" w:space="0" w:sz="8" w:val="single"/>
+              <w:left w:color="000000" w:space="0" w:sz="8" w:val="single"/>
+              <w:bottom w:color="000000" w:space="0" w:sz="8" w:val="single"/>
+              <w:right w:color="000000" w:space="0" w:sz="8" w:val="single"/>
+            </w:tcBorders>
+            <w:tcMar>
+              <w:top w:w="100.0" w:type="dxa"/>
+              <w:left w:w="100.0" w:type="dxa"/>
+              <w:bottom w:w="100.0" w:type="dxa"/>
+              <w:right w:w="100.0" w:type="dxa"/>
+            </w:tcMar>
+            <w:vAlign w:val="top"/>
+          </w:tcPr>
+          <w:p>
+            <w:pPr>
+              <w:rPr/>
+            </w:pPr>
+            <w:r>
+              <w:rPr>
+                <w:rtl w:val="0"/>
+              </w:rPr>
+              <w:t xml:space="preserve">Giao diện phải hiển thị đúng và dùng được đầy đủ chức năng trên Chrome, Firefox, Safari phiên bản mới nhất, với màn hình rộng từ 360 px đến 1920 px, không xuất hiện thanh cuộn ngang.</w:t>
+            </w:r>
+          </w:p>
+        </w:tc>
+        <w:tc>
+          <w:tcPr>
+            <w:tcBorders>
+              <w:top w:color="000000" w:space="0" w:sz="8" w:val="single"/>
+              <w:left w:color="000000" w:space="0" w:sz="8" w:val="single"/>
+              <w:bottom w:color="000000" w:space="0" w:sz="8" w:val="single"/>
+              <w:right w:color="000000" w:space="0" w:sz="8" w:val="single"/>
+            </w:tcBorders>
+            <w:tcMar>
+              <w:top w:w="100.0" w:type="dxa"/>
+              <w:left w:w="100.0" w:type="dxa"/>
+              <w:bottom w:w="100.0" w:type="dxa"/>
+              <w:right w:w="100.0" w:type="dxa"/>
+            </w:tcMar>
+            <w:vAlign w:val="top"/>
+          </w:tcPr>
+          <w:p>
+            <w:pPr>
+              <w:rPr/>
+            </w:pPr>
+            <w:r>
+              <w:rPr>
+                <w:rtl w:val="0"/>
+              </w:rPr>
+              <w:t xml:space="preserve">Kiểm thử thủ công các màn hình chính trên Chrome DevTools (360, 768, 1366, 1920 px), 1 điện thoại Android và 1 iPhone; ghi kết quả vào checklist.</w:t>
             </w:r>
           </w:p>
         </w:tc>
@@ -7882,112 +7794,113 @@
         <w:tc>
           <w:tcPr>
             <w:tcBorders>
-              <w:top w:color="000000" w:space="0" w:sz="4" w:val="single"/>
-              <w:left w:color="000000" w:space="0" w:sz="4" w:val="single"/>
-              <w:bottom w:color="000000" w:space="0" w:sz="4" w:val="single"/>
-              <w:right w:color="000000" w:space="0" w:sz="4" w:val="single"/>
-            </w:tcBorders>
-            <w:tcMar>
-              <w:top w:w="0.0" w:type="dxa"/>
-              <w:left w:w="108.0" w:type="dxa"/>
-              <w:bottom w:w="0.0" w:type="dxa"/>
-              <w:right w:w="108.0" w:type="dxa"/>
-            </w:tcMar>
-          </w:tcPr>
-          <w:p>
-            <w:pPr>
-              <w:spacing w:after="40" w:lineRule="auto"/>
-              <w:jc w:val="left"/>
-              <w:rPr/>
-            </w:pPr>
-            <w:r>
-              <w:rPr>
-                <w:rtl w:val="0"/>
-              </w:rPr>
-            </w:r>
-          </w:p>
-        </w:tc>
-        <w:tc>
-          <w:tcPr>
-            <w:tcBorders>
-              <w:top w:color="000000" w:space="0" w:sz="4" w:val="single"/>
-              <w:left w:color="000000" w:space="0" w:sz="4" w:val="single"/>
-              <w:bottom w:color="000000" w:space="0" w:sz="4" w:val="single"/>
-              <w:right w:color="000000" w:space="0" w:sz="4" w:val="single"/>
-            </w:tcBorders>
-            <w:tcMar>
-              <w:top w:w="0.0" w:type="dxa"/>
-              <w:left w:w="108.0" w:type="dxa"/>
-              <w:bottom w:w="0.0" w:type="dxa"/>
-              <w:right w:w="108.0" w:type="dxa"/>
-            </w:tcMar>
-          </w:tcPr>
-          <w:p>
-            <w:pPr>
-              <w:spacing w:after="40" w:lineRule="auto"/>
-              <w:jc w:val="left"/>
-              <w:rPr/>
-            </w:pPr>
-            <w:r>
-              <w:rPr>
-                <w:rtl w:val="0"/>
-              </w:rPr>
-            </w:r>
-          </w:p>
-        </w:tc>
-        <w:tc>
-          <w:tcPr>
-            <w:tcBorders>
-              <w:top w:color="000000" w:space="0" w:sz="4" w:val="single"/>
-              <w:left w:color="000000" w:space="0" w:sz="4" w:val="single"/>
-              <w:bottom w:color="000000" w:space="0" w:sz="4" w:val="single"/>
-              <w:right w:color="000000" w:space="0" w:sz="4" w:val="single"/>
-            </w:tcBorders>
-            <w:tcMar>
-              <w:top w:w="0.0" w:type="dxa"/>
-              <w:left w:w="108.0" w:type="dxa"/>
-              <w:bottom w:w="0.0" w:type="dxa"/>
-              <w:right w:w="108.0" w:type="dxa"/>
-            </w:tcMar>
-          </w:tcPr>
-          <w:p>
-            <w:pPr>
-              <w:spacing w:after="40" w:lineRule="auto"/>
-              <w:jc w:val="left"/>
-              <w:rPr/>
-            </w:pPr>
-            <w:r>
-              <w:rPr>
-                <w:rtl w:val="0"/>
-              </w:rPr>
-            </w:r>
-          </w:p>
-        </w:tc>
-        <w:tc>
-          <w:tcPr>
-            <w:tcBorders>
-              <w:top w:color="000000" w:space="0" w:sz="4" w:val="single"/>
-              <w:left w:color="000000" w:space="0" w:sz="4" w:val="single"/>
-              <w:bottom w:color="000000" w:space="0" w:sz="4" w:val="single"/>
-              <w:right w:color="000000" w:space="0" w:sz="4" w:val="single"/>
-            </w:tcBorders>
-            <w:tcMar>
-              <w:top w:w="0.0" w:type="dxa"/>
-              <w:left w:w="108.0" w:type="dxa"/>
-              <w:bottom w:w="0.0" w:type="dxa"/>
-              <w:right w:w="108.0" w:type="dxa"/>
-            </w:tcMar>
-          </w:tcPr>
-          <w:p>
-            <w:pPr>
-              <w:spacing w:after="40" w:lineRule="auto"/>
-              <w:jc w:val="left"/>
-              <w:rPr/>
-            </w:pPr>
-            <w:r>
-              <w:rPr>
-                <w:rtl w:val="0"/>
-              </w:rPr>
+              <w:top w:color="000000" w:space="0" w:sz="8" w:val="single"/>
+              <w:left w:color="000000" w:space="0" w:sz="8" w:val="single"/>
+              <w:bottom w:color="000000" w:space="0" w:sz="8" w:val="single"/>
+              <w:right w:color="000000" w:space="0" w:sz="8" w:val="single"/>
+            </w:tcBorders>
+            <w:tcMar>
+              <w:top w:w="100.0" w:type="dxa"/>
+              <w:left w:w="100.0" w:type="dxa"/>
+              <w:bottom w:w="100.0" w:type="dxa"/>
+              <w:right w:w="100.0" w:type="dxa"/>
+            </w:tcMar>
+            <w:vAlign w:val="top"/>
+          </w:tcPr>
+          <w:p>
+            <w:pPr>
+              <w:rPr/>
+            </w:pPr>
+            <w:r>
+              <w:rPr>
+                <w:rtl w:val="0"/>
+              </w:rPr>
+              <w:t xml:space="preserve">NFR-05</w:t>
+            </w:r>
+          </w:p>
+        </w:tc>
+        <w:tc>
+          <w:tcPr>
+            <w:tcBorders>
+              <w:top w:color="000000" w:space="0" w:sz="8" w:val="single"/>
+              <w:left w:color="000000" w:space="0" w:sz="8" w:val="single"/>
+              <w:bottom w:color="000000" w:space="0" w:sz="8" w:val="single"/>
+              <w:right w:color="000000" w:space="0" w:sz="8" w:val="single"/>
+            </w:tcBorders>
+            <w:tcMar>
+              <w:top w:w="100.0" w:type="dxa"/>
+              <w:left w:w="100.0" w:type="dxa"/>
+              <w:bottom w:w="100.0" w:type="dxa"/>
+              <w:right w:w="100.0" w:type="dxa"/>
+            </w:tcMar>
+            <w:vAlign w:val="top"/>
+          </w:tcPr>
+          <w:p>
+            <w:pPr>
+              <w:rPr/>
+            </w:pPr>
+            <w:r>
+              <w:rPr>
+                <w:rtl w:val="0"/>
+              </w:rPr>
+              <w:t xml:space="preserve">Availability</w:t>
+            </w:r>
+          </w:p>
+        </w:tc>
+        <w:tc>
+          <w:tcPr>
+            <w:tcBorders>
+              <w:top w:color="000000" w:space="0" w:sz="8" w:val="single"/>
+              <w:left w:color="000000" w:space="0" w:sz="8" w:val="single"/>
+              <w:bottom w:color="000000" w:space="0" w:sz="8" w:val="single"/>
+              <w:right w:color="000000" w:space="0" w:sz="8" w:val="single"/>
+            </w:tcBorders>
+            <w:tcMar>
+              <w:top w:w="100.0" w:type="dxa"/>
+              <w:left w:w="100.0" w:type="dxa"/>
+              <w:bottom w:w="100.0" w:type="dxa"/>
+              <w:right w:w="100.0" w:type="dxa"/>
+            </w:tcMar>
+            <w:vAlign w:val="top"/>
+          </w:tcPr>
+          <w:p>
+            <w:pPr>
+              <w:rPr/>
+            </w:pPr>
+            <w:r>
+              <w:rPr>
+                <w:rtl w:val="0"/>
+              </w:rPr>
+              <w:t xml:space="preserve">Hệ thống phải hoạt động (uptime) ≥ 99% trong giai đoạn kiểm thử và demo (tuần 10–11).</w:t>
+            </w:r>
+          </w:p>
+        </w:tc>
+        <w:tc>
+          <w:tcPr>
+            <w:tcBorders>
+              <w:top w:color="000000" w:space="0" w:sz="8" w:val="single"/>
+              <w:left w:color="000000" w:space="0" w:sz="8" w:val="single"/>
+              <w:bottom w:color="000000" w:space="0" w:sz="8" w:val="single"/>
+              <w:right w:color="000000" w:space="0" w:sz="8" w:val="single"/>
+            </w:tcBorders>
+            <w:tcMar>
+              <w:top w:w="100.0" w:type="dxa"/>
+              <w:left w:w="100.0" w:type="dxa"/>
+              <w:bottom w:w="100.0" w:type="dxa"/>
+              <w:right w:w="100.0" w:type="dxa"/>
+            </w:tcMar>
+            <w:vAlign w:val="top"/>
+          </w:tcPr>
+          <w:p>
+            <w:pPr>
+              <w:rPr/>
+            </w:pPr>
+            <w:r>
+              <w:rPr>
+                <w:rFonts w:ascii="Arial" w:cs="Arial" w:eastAsia="Arial" w:hAnsi="Arial"/>
+                <w:rtl w:val="0"/>
+              </w:rPr>
+              <w:t xml:space="preserve">Theo dõi bằng UptimeRobot, kiểm tra mỗi 5 phút; xuất báo cáo uptime cuối tuần 11.</w:t>
             </w:r>
           </w:p>
         </w:tc>

</xml_diff>